<commit_message>
feat: animación de bienvenida, segunda tanda de íconos SVG y fixes de contraste
- Nueva pantalla splash.html: video de bienvenida comprimido (4MB -> 557KB),
  fade in/out, botón de repetir en el feed, precarga de assets durante
  la reproducción
- Segunda tanda de íconos SVG del diseñador: Por Subregión/Flora/Fauna/Hongos,
  Cuencas Hídricas/Abastecedoras, JPL/Guarda Cuencas/Especie del Mes
- Fix de ícono sobredimensionado y halo de contraste en las 7 tarjetas de
  Ecosistemas Estratégicos
- Fix de contraste de texto en Especie del Mes y en los hero de Agua/Ecosistemas
- Infográfico de ecosistemas actualizado (Cavernas y Cuevas integrado, regla
  eliminada), fondo de Biodiversidad reemplazado
- Guarda Cuencas y JPL: 3 modalidades de vista + píldoras de subregión
- Sincroniza documentos de TI Gobernación (Revisión 3, Plan de Cambios)

Co-Authored-By: Claude Sonnet 5 <noreply@anthropic.com>
</commit_message>
<xml_diff>
--- a/Documentos gobernacion/TI/REVISION 3/Documento Integral de Desarrollo Tecnico de la Aplicacion.docx
+++ b/Documentos gobernacion/TI/REVISION 3/Documento Integral de Desarrollo Tecnico de la Aplicacion.docx
@@ -30,7 +30,7 @@
             <mc:AlternateContent>
               <mc:Choice Requires="wpg">
                 <w:drawing>
-                  <wp:anchor distT="0" distB="0" distL="114300" distR="114300" simplePos="0" relativeHeight="251662336" behindDoc="0" locked="0" layoutInCell="1" allowOverlap="1" wp14:anchorId="568B8752" wp14:editId="23398858">
+                  <wp:anchor distT="0" distB="0" distL="114300" distR="114300" simplePos="0" relativeHeight="251662336" behindDoc="0" locked="0" layoutInCell="1" allowOverlap="1" wp14:anchorId="30F16AD6" wp14:editId="23398858">
                     <wp:simplePos x="0" y="0"/>
                     <wp:positionH relativeFrom="page">
                       <wp:posOffset>304800</wp:posOffset>
@@ -293,7 +293,7 @@
             <mc:AlternateContent>
               <mc:Choice Requires="wps">
                 <w:drawing>
-                  <wp:anchor distT="0" distB="0" distL="114300" distR="114300" simplePos="0" relativeHeight="251660288" behindDoc="0" locked="0" layoutInCell="1" allowOverlap="1" wp14:anchorId="5E182381" wp14:editId="659FECCB">
+                  <wp:anchor distT="0" distB="0" distL="114300" distR="114300" simplePos="0" relativeHeight="251660288" behindDoc="0" locked="0" layoutInCell="1" allowOverlap="1" wp14:anchorId="389C64D1" wp14:editId="659FECCB">
                     <wp:simplePos x="0" y="0"/>
                     <wp:positionH relativeFrom="page">
                       <wp:align>center</wp:align>
@@ -533,7 +533,7 @@
             <mc:AlternateContent>
               <mc:Choice Requires="wps">
                 <w:drawing>
-                  <wp:anchor distT="0" distB="0" distL="114300" distR="114300" simplePos="0" relativeHeight="251661312" behindDoc="0" locked="0" layoutInCell="1" allowOverlap="1" wp14:anchorId="0D29340C" wp14:editId="00BE706D">
+                  <wp:anchor distT="0" distB="0" distL="114300" distR="114300" simplePos="0" relativeHeight="251661312" behindDoc="0" locked="0" layoutInCell="1" allowOverlap="1" wp14:anchorId="62D46DEE" wp14:editId="00BE706D">
                     <wp:simplePos x="0" y="0"/>
                     <wp:positionH relativeFrom="page">
                       <wp:align>center</wp:align>
@@ -747,7 +747,7 @@
             <mc:AlternateContent>
               <mc:Choice Requires="wps">
                 <w:drawing>
-                  <wp:anchor distT="0" distB="0" distL="114300" distR="114300" simplePos="0" relativeHeight="251659264" behindDoc="0" locked="0" layoutInCell="1" allowOverlap="1" wp14:anchorId="24EBC4B0" wp14:editId="03E56B89">
+                  <wp:anchor distT="0" distB="0" distL="114300" distR="114300" simplePos="0" relativeHeight="251659264" behindDoc="0" locked="0" layoutInCell="1" allowOverlap="1" wp14:anchorId="0A8A32A8" wp14:editId="03E56B89">
                     <wp:simplePos x="0" y="0"/>
                     <wp:positionH relativeFrom="page">
                       <wp:align>center</wp:align>
@@ -3996,7 +3996,7 @@
                     <w:noProof/>
                     <w:webHidden/>
                   </w:rPr>
-                  <w:t>28</w:t>
+                  <w:t>29</w:t>
                 </w:r>
                 <w:r>
                   <w:rPr>
@@ -4176,7 +4176,7 @@
                     <w:noProof/>
                     <w:webHidden/>
                   </w:rPr>
-                  <w:t>29</w:t>
+                  <w:t>30</w:t>
                 </w:r>
                 <w:r>
                   <w:rPr>
@@ -4262,7 +4262,7 @@
                     <w:noProof/>
                     <w:webHidden/>
                   </w:rPr>
-                  <w:t>30</w:t>
+                  <w:t>31</w:t>
                 </w:r>
                 <w:r>
                   <w:rPr>
@@ -4349,7 +4349,7 @@
                     <w:noProof/>
                     <w:webHidden/>
                   </w:rPr>
-                  <w:t>30</w:t>
+                  <w:t>31</w:t>
                 </w:r>
                 <w:r>
                   <w:rPr>
@@ -4439,7 +4439,7 @@
                     <w:noProof/>
                     <w:webHidden/>
                   </w:rPr>
-                  <w:t>30</w:t>
+                  <w:t>31</w:t>
                 </w:r>
                 <w:r>
                   <w:rPr>
@@ -4538,7 +4538,7 @@
                     <w:noProof/>
                     <w:webHidden/>
                   </w:rPr>
-                  <w:t>31</w:t>
+                  <w:t>32</w:t>
                 </w:r>
                 <w:r>
                   <w:rPr>
@@ -4628,7 +4628,7 @@
                     <w:noProof/>
                     <w:webHidden/>
                   </w:rPr>
-                  <w:t>31</w:t>
+                  <w:t>32</w:t>
                 </w:r>
                 <w:r>
                   <w:rPr>
@@ -4718,7 +4718,7 @@
                     <w:noProof/>
                     <w:webHidden/>
                   </w:rPr>
-                  <w:t>31</w:t>
+                  <w:t>32</w:t>
                 </w:r>
                 <w:r>
                   <w:rPr>
@@ -4804,7 +4804,7 @@
                     <w:noProof/>
                     <w:webHidden/>
                   </w:rPr>
-                  <w:t>32</w:t>
+                  <w:t>33</w:t>
                 </w:r>
                 <w:r>
                   <w:rPr>
@@ -4894,7 +4894,7 @@
                     <w:noProof/>
                     <w:webHidden/>
                   </w:rPr>
-                  <w:t>32</w:t>
+                  <w:t>33</w:t>
                 </w:r>
                 <w:r>
                   <w:rPr>
@@ -4984,7 +4984,7 @@
                     <w:noProof/>
                     <w:webHidden/>
                   </w:rPr>
-                  <w:t>32</w:t>
+                  <w:t>33</w:t>
                 </w:r>
                 <w:r>
                   <w:rPr>
@@ -5074,7 +5074,7 @@
                     <w:noProof/>
                     <w:webHidden/>
                   </w:rPr>
-                  <w:t>33</w:t>
+                  <w:t>34</w:t>
                 </w:r>
                 <w:r>
                   <w:rPr>
@@ -5164,7 +5164,7 @@
                     <w:noProof/>
                     <w:webHidden/>
                   </w:rPr>
-                  <w:t>33</w:t>
+                  <w:t>35</w:t>
                 </w:r>
                 <w:r>
                   <w:rPr>
@@ -5254,7 +5254,7 @@
                     <w:noProof/>
                     <w:webHidden/>
                   </w:rPr>
-                  <w:t>34</w:t>
+                  <w:t>35</w:t>
                 </w:r>
                 <w:r>
                   <w:rPr>
@@ -5344,7 +5344,7 @@
                     <w:noProof/>
                     <w:webHidden/>
                   </w:rPr>
-                  <w:t>34</w:t>
+                  <w:t>35</w:t>
                 </w:r>
                 <w:r>
                   <w:rPr>
@@ -5434,7 +5434,7 @@
                     <w:noProof/>
                     <w:webHidden/>
                   </w:rPr>
-                  <w:t>34</w:t>
+                  <w:t>36</w:t>
                 </w:r>
                 <w:r>
                   <w:rPr>
@@ -5520,7 +5520,7 @@
                     <w:noProof/>
                     <w:webHidden/>
                   </w:rPr>
-                  <w:t>36</w:t>
+                  <w:t>38</w:t>
                 </w:r>
                 <w:r>
                   <w:rPr>
@@ -5609,7 +5609,7 @@
                     <w:noProof/>
                     <w:webHidden/>
                   </w:rPr>
-                  <w:t>36</w:t>
+                  <w:t>38</w:t>
                 </w:r>
                 <w:r>
                   <w:rPr>
@@ -5695,7 +5695,7 @@
                     <w:noProof/>
                     <w:webHidden/>
                   </w:rPr>
-                  <w:t>39</w:t>
+                  <w:t>41</w:t>
                 </w:r>
                 <w:r>
                   <w:rPr>
@@ -5781,7 +5781,7 @@
                     <w:noProof/>
                     <w:webHidden/>
                   </w:rPr>
-                  <w:t>39</w:t>
+                  <w:t>41</w:t>
                 </w:r>
                 <w:r>
                   <w:rPr>
@@ -5851,7 +5851,7 @@
                     <w:noProof/>
                     <w:webHidden/>
                   </w:rPr>
-                  <w:t>40</w:t>
+                  <w:t>42</w:t>
                 </w:r>
                 <w:r>
                   <w:rPr>
@@ -6094,8 +6094,9 @@
         <w:rPr>
           <w:noProof/>
         </w:rPr>
+        <w:lastRenderedPageBreak/>
         <w:drawing>
-          <wp:inline distT="0" distB="0" distL="0" distR="0" wp14:anchorId="022B61D8" wp14:editId="5555431B">
+          <wp:inline distT="0" distB="0" distL="0" distR="0" wp14:anchorId="72C61FC9" wp14:editId="5555431B">
             <wp:extent cx="5524500" cy="5886426"/>
             <wp:effectExtent l="0" t="0" r="0" b="0"/>
             <wp:docPr id="1" name="Imagen 1"/>
@@ -6156,6 +6157,7 @@
         <w:pStyle w:val="Ttulo3"/>
       </w:pPr>
       <w:r>
+        <w:lastRenderedPageBreak/>
         <w:t xml:space="preserve"> </w:t>
       </w:r>
       <w:bookmarkStart w:id="4" w:name="_Toc236247219"/>
@@ -6175,7 +6177,7 @@
           <w:noProof/>
         </w:rPr>
         <w:drawing>
-          <wp:inline distT="0" distB="0" distL="0" distR="0" wp14:anchorId="6C8DEBD4" wp14:editId="1B9D208D">
+          <wp:inline distT="0" distB="0" distL="0" distR="0" wp14:anchorId="35BE4A2C" wp14:editId="1B9D208D">
             <wp:extent cx="5524500" cy="2200275"/>
             <wp:effectExtent l="0" t="0" r="0" b="0"/>
             <wp:docPr id="4558373" name="Imagen 4558373"/>
@@ -6250,8 +6252,9 @@
         <w:rPr>
           <w:noProof/>
         </w:rPr>
+        <w:lastRenderedPageBreak/>
         <w:drawing>
-          <wp:inline distT="0" distB="0" distL="0" distR="0" wp14:anchorId="4C510231" wp14:editId="5ACDEEB6">
+          <wp:inline distT="0" distB="0" distL="0" distR="0" wp14:anchorId="60303FE4" wp14:editId="5ACDEEB6">
             <wp:extent cx="5524500" cy="2828925"/>
             <wp:effectExtent l="0" t="0" r="0" b="0"/>
             <wp:docPr id="1482111848" name="Imagen 1482111848"/>
@@ -6322,7 +6325,7 @@
           <w:noProof/>
         </w:rPr>
         <w:drawing>
-          <wp:inline distT="0" distB="0" distL="0" distR="0" wp14:anchorId="354048EF" wp14:editId="7E3AC88B">
+          <wp:inline distT="0" distB="0" distL="0" distR="0" wp14:anchorId="360FF9BA" wp14:editId="7E3AC88B">
             <wp:extent cx="5524500" cy="1800225"/>
             <wp:effectExtent l="0" t="0" r="0" b="0"/>
             <wp:docPr id="329624652" name="Imagen 329624652"/>
@@ -6384,6 +6387,7 @@
         <w:pStyle w:val="Ttulo3"/>
       </w:pPr>
       <w:r>
+        <w:lastRenderedPageBreak/>
         <w:t xml:space="preserve"> </w:t>
       </w:r>
       <w:bookmarkStart w:id="5" w:name="_Toc236247220"/>
@@ -6459,6 +6463,7 @@
       </w:pPr>
       <w:bookmarkStart w:id="6" w:name="_Toc236247221"/>
       <w:r>
+        <w:lastRenderedPageBreak/>
         <w:t>Tecnologías</w:t>
       </w:r>
       <w:bookmarkEnd w:id="6"/>
@@ -7977,7 +7982,17 @@
                 <w:sz w:val="20"/>
                 <w:szCs w:val="20"/>
               </w:rPr>
-              <w:t>Autenticación del panel admin, contraseña hasheada (nunca texto plano)</w:t>
+              <w:t xml:space="preserve">Autenticación del panel admin, contraseña </w:t>
+            </w:r>
+            <w:r>
+              <w:rPr>
+                <w:rFonts w:eastAsia="Arial" w:cs="Arial"/>
+                <w:color w:val="333333"/>
+                <w:sz w:val="20"/>
+                <w:szCs w:val="20"/>
+              </w:rPr>
+              <w:lastRenderedPageBreak/>
+              <w:t>hasheada (nunca texto plano)</w:t>
             </w:r>
           </w:p>
         </w:tc>
@@ -8006,6 +8021,7 @@
                 <w:sz w:val="20"/>
                 <w:szCs w:val="20"/>
               </w:rPr>
+              <w:lastRenderedPageBreak/>
               <w:t>Backend / Seguridad</w:t>
             </w:r>
           </w:p>
@@ -8643,6 +8659,7 @@
     </w:p>
     <w:p>
       <w:r>
+        <w:lastRenderedPageBreak/>
         <w:t>Redis: elegido por ser el estándar de facto para caché en aplicaciones Node.js, con modo degradado nativo (la app sigue funcionando si Redis no está disponible, solo pierde el beneficio de velocidad).</w:t>
       </w:r>
     </w:p>
@@ -8679,6 +8696,7 @@
       </w:pPr>
       <w:bookmarkStart w:id="9" w:name="_Toc236247224"/>
       <w:r>
+        <w:lastRenderedPageBreak/>
         <w:t>Metodología y Herramientas</w:t>
       </w:r>
       <w:bookmarkEnd w:id="9"/>
@@ -8830,6 +8848,7 @@
         <w:spacing w:after="120"/>
       </w:pPr>
       <w:r>
+        <w:lastRenderedPageBreak/>
         <w:t>Repositorio de desarrollo en GitHub</w:t>
       </w:r>
       <w:r>
@@ -9434,9 +9453,12 @@
       </w:tr>
     </w:tbl>
     <w:p>
-      <w:pPr/>
-      <w:r>
-        <w:t>Nota: azure-pipelines.yml se propone como pipeline de referencia (CI + CD) mientras no se conoce el pipeline institucional de TI Gobernación. Si TI ya cuenta con una plantilla o pipeline estándar para proyectos de la Secretaría de Ambiente, se solicita explícitamente compartirla para alinear (o reemplazar) la fase de CI de este proyecto con esa plantilla, dejando como aporte propio del proyecto la fase de CD (build y despliegue al servidor institucional) sobre lo que TI ya tenga configurado.</w:t>
+      <w:r>
+        <w:t xml:space="preserve">Nota: azure-pipelines.yml implementa la arquitectura de línea base oficial de Microsoft para Azure Pipelines ("CI/CD baseline architecture", Microsoft </w:t>
+      </w:r>
+      <w:r>
+        <w:lastRenderedPageBreak/>
+        <w:t>Learn) — el estándar publicado por el propio fabricante de la plataforma, no un diseño propio ni improvisado del contratista. Sigue su mismo patrón: quality gates en la etapa de CI (lint, SAST, pruebas, cobertura), construcción de un único artefacto — la imagen Docker — que se escanea y se publica una sola vez, y despliegue con aprobación manual obligatoria antes de producción (más smoke test post-despliegue y rollback automático, ver numeral 10). Ante la falta de una plantilla propia de TI Gobernación para proyectos de la Secretaría de Ambiente pese a la solicitud formal ya enviada, se adopta este estándar de Microsoft como referencia definitiva; si en el futuro TI comparte una plantilla institucional, el proyecto se alineará a ella sin costo adicional.</w:t>
       </w:r>
     </w:p>
     <w:p>
@@ -9526,6 +9548,7 @@
       </w:pPr>
       <w:bookmarkStart w:id="15" w:name="_Toc236247230"/>
       <w:r>
+        <w:lastRenderedPageBreak/>
         <w:t>Infraestructura</w:t>
       </w:r>
       <w:bookmarkEnd w:id="15"/>
@@ -9587,6 +9610,7 @@
         <w:rPr>
           <w:rFonts w:eastAsiaTheme="minorHAnsi"/>
         </w:rPr>
+        <w:lastRenderedPageBreak/>
         <w:t>Diagrama de Infraestructura:</w:t>
       </w:r>
       <w:bookmarkEnd w:id="16"/>
@@ -9607,7 +9631,7 @@
           <w:noProof/>
         </w:rPr>
         <w:drawing>
-          <wp:inline distT="0" distB="0" distL="0" distR="0" wp14:anchorId="07573081" wp14:editId="36EC709F">
+          <wp:inline distT="0" distB="0" distL="0" distR="0" wp14:anchorId="1DEC1DA1" wp14:editId="36EC709F">
             <wp:extent cx="4343400" cy="5913459"/>
             <wp:effectExtent l="0" t="0" r="0" b="0"/>
             <wp:docPr id="1981030874" name="Imagen 1981030874"/>
@@ -9675,6 +9699,7 @@
         <w:rPr>
           <w:rFonts w:eastAsiaTheme="minorHAnsi"/>
         </w:rPr>
+        <w:lastRenderedPageBreak/>
         <w:t>Entornos de Despliegue:</w:t>
       </w:r>
       <w:bookmarkEnd w:id="17"/>
@@ -9974,7 +9999,7 @@
                 <w:sz w:val="21"/>
                 <w:szCs w:val="21"/>
               </w:rPr>
-              <w:t>Frontend y backend desplegados juntos en el servidor institucional (Ubuntu 24.04): Nginx sirve el frontend y hace proxy inverso al backend (PM2). El manual de despliegue (README.md) ya cubre el procedimiento completo. Pendiente de la entrega del servidor por parte de TI Gobernación. Ver Estado de Completitud</w:t>
+              <w:t>Frontend y backend desplegados juntos en el servidor institucional (Ubuntu 24.04): Nginx sirve el frontend y hace proxy inverso al backend, que corre en un contenedor Docker (restart: unless-stopped). El manual de despliegue (README.md) ya cubre el procedimiento completo. Pendiente de la entrega del servidor por parte de TI Gobernación. Ver Estado de Completitud</w:t>
             </w:r>
           </w:p>
         </w:tc>
@@ -10282,7 +10307,7 @@
                 <w:sz w:val="21"/>
                 <w:szCs w:val="21"/>
               </w:rPr>
-              <w:t>PM2 (gestor de procesos, reinicio automático)</w:t>
+              <w:t>Docker Compose — contenedor del backend con restart: unless-stopped (reinicio automático); Dockerfile multi-stage, usuario non-root, HEALTHCHECK contra /api/health</w:t>
             </w:r>
           </w:p>
         </w:tc>
@@ -10513,7 +10538,7 @@
       </w:r>
       <w:r>
         <w:tab/>
-        <w:t>Redis absorbe la carga de lectura del catálogo (prácticamente estático), evitando que picos de tráfico —por ejemplo al difundir el código QR en un evento público— golpeen directamente a MongoDB.</w:t>
+        <w:t>Redis absorbe la carga de lectura de las consultas del panel de administración (JPL, Guarda Cuencas, usuarios) contra MongoDB, evitando que picos de uso del panel golpeen directamente la base de datos; el catálogo público de especies no pasa por Redis ni por MongoDB, se sirve como JSON estático directamente al frontend.</w:t>
       </w:r>
     </w:p>
     <w:p>
@@ -10536,6 +10561,7 @@
     </w:p>
     <w:p>
       <w:r>
+        <w:lastRenderedPageBreak/>
         <w:t>●</w:t>
       </w:r>
       <w:r>
@@ -10588,6 +10614,7 @@
       </w:pPr>
       <w:bookmarkStart w:id="21" w:name="_Toc236247236"/>
       <w:r>
+        <w:lastRenderedPageBreak/>
         <w:t>Base de Datos</w:t>
       </w:r>
       <w:bookmarkEnd w:id="21"/>
@@ -10695,6 +10722,7 @@
           <w:rFonts w:eastAsia="Times New Roman"/>
           <w:lang w:eastAsia="es-CO"/>
         </w:rPr>
+        <w:lastRenderedPageBreak/>
         <w:t>Diagrama del Modelo de Datos:</w:t>
       </w:r>
       <w:bookmarkEnd w:id="23"/>
@@ -10716,7 +10744,7 @@
           <w:noProof/>
         </w:rPr>
         <w:drawing>
-          <wp:inline distT="0" distB="0" distL="0" distR="0" wp14:anchorId="0A51F3C7" wp14:editId="0501DF34">
+          <wp:inline distT="0" distB="0" distL="0" distR="0" wp14:anchorId="063960CA" wp14:editId="0501DF34">
             <wp:extent cx="5524500" cy="2419350"/>
             <wp:effectExtent l="0" t="0" r="0" b="0"/>
             <wp:docPr id="779773818" name="Imagen 779773818"/>
@@ -10897,6 +10925,7 @@
           <w:sz w:val="23"/>
           <w:szCs w:val="23"/>
         </w:rPr>
+        <w:lastRenderedPageBreak/>
         <w:t>CommunitySighting y Municipality — colecciones definidas, sin ruta activa</w:t>
       </w:r>
       <w:bookmarkEnd w:id="29"/>
@@ -11015,6 +11044,7 @@
           <w:sz w:val="20"/>
           <w:szCs w:val="20"/>
         </w:rPr>
+        <w:lastRenderedPageBreak/>
         <w:t>JplPhoto: { mes: 1, orden: 1 } JplPhoto: { mes: 1, publicado: 1 } GcPhoto:  { mes: 1, orden: 1 }</w:t>
       </w:r>
     </w:p>
@@ -11059,6 +11089,7 @@
       </w:pPr>
       <w:bookmarkStart w:id="34" w:name="_Toc236247246"/>
       <w:r>
+        <w:lastRenderedPageBreak/>
         <w:t>Seguridad (Manejo de la Seguridad)</w:t>
       </w:r>
       <w:bookmarkEnd w:id="34"/>
@@ -11100,6 +11131,7 @@
     </w:p>
     <w:p>
       <w:r>
+        <w:lastRenderedPageBreak/>
         <w:t>Autorización: basada en 3 roles (Curador.Biodiversidad, Curador.GuardaCuencas y Admin.Contenido), cada uno limitado a su propio módulo del panel — Admin.Contenido es superrole, con acceso a todo, incluida la gestión de usuarios. Ya no existe ninguna cuenta compartida ni genérica: cada curador tiene usuario y contraseña propios, gestionados desde un panel dedicado (/admin/usuarios.html) donde un Admin.Contenido puede crear, editar y desactivar cuentas. Desactivar revoca el acceso de inmediato — se valida en cada petición contra la base de datos, no solo al iniciar sesión — sin afectar a los demás curadores.</w:t>
       </w:r>
     </w:p>
@@ -11135,7 +11167,11 @@
     </w:p>
     <w:p>
       <w:r>
-        <w:t>Cifrado en tránsito: documentado y listo en el manual de despliegue (Nginx + Let's Encrypt/Certbot, TLS 1.2+); su verificación en vivo depende del mismo servidor de producción listado como pendiente de TI Gobernación en el Estado de Completitud (no es un punto adicional). Cifrado en reposo: provisto por defecto por MongoDB Atlas en todos sus clusters, incluido el plan gratuito M0 usado actualmente. No hay datos sensibles tipo cédula o documento de identidad en ninguna base; sí hay nombres de pila de fotógrafos comunitarios (campo "credito"), provistos voluntariamente al participar en los programas y ya destinados a publicarse como crédito visible en las galerías (ver services/publicacion.js), es decir, no es información confidencial que deba protegerse de exposición, solo un dato pendiente de que exista un ambiente de Producción separado (sección 6.2).</w:t>
+        <w:t xml:space="preserve">Cifrado en tránsito: documentado y listo en el manual de despliegue (Nginx + Let's Encrypt/Certbot, TLS 1.2+); su verificación en vivo depende del mismo servidor de producción listado como pendiente de TI Gobernación en el Estado de Completitud (no es un punto adicional). Cifrado en reposo: provisto por defecto por MongoDB Atlas en todos sus clusters, incluido el plan gratuito M0 usado actualmente. No hay datos sensibles tipo cédula o documento de identidad en ninguna base; sí hay nombres de pila de fotógrafos comunitarios (campo "credito"), provistos voluntariamente al participar en los programas y ya destinados a publicarse como crédito visible en las galerías (ver </w:t>
+      </w:r>
+      <w:r>
+        <w:lastRenderedPageBreak/>
+        <w:t>services/publicacion.js), es decir, no es información confidencial que deba protegerse de exposición, solo un dato pendiente de que exista un ambiente de Producción separado (sección 6.2).</w:t>
       </w:r>
     </w:p>
     <w:p>
@@ -11758,7 +11794,7 @@
                 <w:sz w:val="21"/>
                 <w:szCs w:val="21"/>
               </w:rPr>
-              <w:t>Pendiente — la solución de fondo es Microsoft Entra ID (ítem B1 del roadmap, sección 1</w:t>
+              <w:t>Implementado (2026-08-06) — MFA vía TOTP (RFC 6238) obligatorio para todos los curadores: código QR en el primer login, código de 6 dígitos junto con la contraseña en los siguientes. Independiente de la migración futura a Microsoft Entra ID (ítem B1 del roadmap, sección 12). Detalle completo en la sección 8.1.</w:t>
             </w:r>
             <w:r>
               <w:rPr>
@@ -11767,7 +11803,6 @@
                 <w:sz w:val="21"/>
                 <w:szCs w:val="21"/>
               </w:rPr>
-              <w:t>2</w:t>
             </w:r>
             <w:r>
               <w:rPr>
@@ -11776,7 +11811,6 @@
                 <w:sz w:val="21"/>
                 <w:szCs w:val="21"/>
               </w:rPr>
-              <w:t>), sujeta a que TI Gobernación provea Client ID y Tenant ID. Mientras tanto, acceso protegido con sesión + contraseña con hash bcrypt</w:t>
             </w:r>
           </w:p>
         </w:tc>
@@ -11826,6 +11860,7 @@
           <w:rFonts w:eastAsia="Times New Roman"/>
           <w:lang w:eastAsia="es-CO"/>
         </w:rPr>
+        <w:lastRenderedPageBreak/>
         <w:t>Auditorías de Seguridad:</w:t>
       </w:r>
       <w:bookmarkEnd w:id="39"/>
@@ -11894,6 +11929,7 @@
       </w:pPr>
       <w:bookmarkStart w:id="40" w:name="_Toc236247252"/>
       <w:r>
+        <w:lastRenderedPageBreak/>
         <w:t>Pruebas y Testing</w:t>
       </w:r>
       <w:bookmarkEnd w:id="40"/>
@@ -11975,6 +12011,7 @@
           <w:rFonts w:eastAsia="Times New Roman"/>
           <w:lang w:eastAsia="es-CO"/>
         </w:rPr>
+        <w:lastRenderedPageBreak/>
         <w:t>Herramientas de Testing</w:t>
       </w:r>
       <w:r>
@@ -12823,6 +12860,7 @@
       </w:pPr>
       <w:bookmarkStart w:id="46" w:name="_Toc236247258"/>
       <w:r>
+        <w:lastRenderedPageBreak/>
         <w:t>Manual Técnico (Despliegues y Operaciones)</w:t>
       </w:r>
       <w:bookmarkEnd w:id="46"/>
@@ -13497,6 +13535,7 @@
     </w:p>
     <w:p>
       <w:r>
+        <w:lastRenderedPageBreak/>
         <w:t>2. Backend: configurar backend/.env.qa a partir de .env.example, apuntando a la BD antioquia-biodiversa-qa.</w:t>
       </w:r>
     </w:p>
@@ -13546,15 +13585,7 @@
       </w:r>
     </w:p>
     <w:p>
-      <w:pPr>
-        <w:rPr>
-          <w:lang w:val="en-US"/>
-        </w:rPr>
-      </w:pPr>
-      <w:r>
-        <w:rPr>
-          <w:lang w:val="en-US"/>
-        </w:rPr>
+      <w:r>
         <w:t>3. docker login &lt;acr-name&gt;.azurecr.io (registry de imágenes, credenciales provistas por TI Gobernación).</w:t>
       </w:r>
     </w:p>
@@ -13600,6 +13631,7 @@
           <w:rFonts w:eastAsia="Times New Roman"/>
           <w:lang w:eastAsia="es-CO"/>
         </w:rPr>
+        <w:lastRenderedPageBreak/>
         <w:t>Procedimiento para Subir y Bajar la Aplicación:</w:t>
       </w:r>
       <w:bookmarkEnd w:id="50"/>
@@ -13759,6 +13791,7 @@
           <w:rFonts w:eastAsia="Times New Roman"/>
           <w:lang w:eastAsia="es-CO"/>
         </w:rPr>
+        <w:lastRenderedPageBreak/>
         <w:t>Monitoreo y Logging:</w:t>
       </w:r>
       <w:bookmarkEnd w:id="52"/>
@@ -13835,6 +13868,7 @@
         </w:rPr>
       </w:pPr>
       <w:r>
+        <w:lastRenderedPageBreak/>
         <w:br w:type="page"/>
       </w:r>
     </w:p>
@@ -13844,6 +13878,7 @@
       </w:pPr>
       <w:bookmarkStart w:id="54" w:name="_Toc236247266"/>
       <w:r>
+        <w:lastRenderedPageBreak/>
         <w:t>Otras Cosas Técnicas (Diagramas de Flujo y Actividades)</w:t>
       </w:r>
       <w:bookmarkEnd w:id="54"/>
@@ -13924,8 +13959,9 @@
         <w:rPr>
           <w:noProof/>
         </w:rPr>
+        <w:lastRenderedPageBreak/>
         <w:drawing>
-          <wp:inline distT="0" distB="0" distL="0" distR="0" wp14:anchorId="20B773FB" wp14:editId="38E92C44">
+          <wp:inline distT="0" distB="0" distL="0" distR="0" wp14:anchorId="6242DACE" wp14:editId="38E92C44">
             <wp:extent cx="4629150" cy="6477000"/>
             <wp:effectExtent l="0" t="0" r="0" b="0"/>
             <wp:docPr id="1871216676" name="Imagen 1871216676"/>
@@ -14013,6 +14049,7 @@
         </w:rPr>
       </w:pPr>
       <w:r>
+        <w:lastRenderedPageBreak/>
         <w:br w:type="page"/>
       </w:r>
     </w:p>
@@ -14022,6 +14059,7 @@
       </w:pPr>
       <w:bookmarkStart w:id="56" w:name="_Toc236247268"/>
       <w:r>
+        <w:lastRenderedPageBreak/>
         <w:t>Roadmap Técnico (Opcional):</w:t>
       </w:r>
       <w:bookmarkEnd w:id="56"/>
@@ -14048,13 +14086,6 @@
       </w:r>
     </w:p>
     <w:p>
-      <w:r>
-        <w:rPr>
-          <w:b/>
-          <w:bCs/>
-          <w:lang w:eastAsia="es-CO"/>
-        </w:rPr>
-      </w:r>
       <w:r>
         <w:rPr>
           <w:lang w:eastAsia="es-CO"/>
@@ -14142,6 +14173,7 @@
           <w:sz w:val="22"/>
           <w:szCs w:val="22"/>
         </w:rPr>
+        <w:lastRenderedPageBreak/>
         <w:t>Por el líder funcional (Secretaría de Ambiente):</w:t>
       </w:r>
     </w:p>
@@ -14279,6 +14311,7 @@
     </w:p>
     <w:p>
       <w:r>
+        <w:lastRenderedPageBreak/>
         <w:t>●</w:t>
       </w:r>
       <w:r>
@@ -14436,7 +14469,7 @@
               <w:lang w:eastAsia="es-CO"/>
             </w:rPr>
             <w:drawing>
-              <wp:anchor distT="0" distB="0" distL="114300" distR="114300" simplePos="0" relativeHeight="251658240" behindDoc="1" locked="0" layoutInCell="1" allowOverlap="1" wp14:anchorId="4CF77B01" wp14:editId="787779DC">
+              <wp:anchor distT="0" distB="0" distL="114300" distR="114300" simplePos="0" relativeHeight="251658240" behindDoc="1" locked="0" layoutInCell="1" allowOverlap="1" wp14:anchorId="48D0801A" wp14:editId="787779DC">
                 <wp:simplePos x="0" y="0"/>
                 <wp:positionH relativeFrom="column">
                   <wp:posOffset>92435</wp:posOffset>
@@ -14780,7 +14813,7 @@
               <w:lang w:eastAsia="es-CO"/>
             </w:rPr>
             <w:drawing>
-              <wp:anchor distT="0" distB="0" distL="114300" distR="114300" simplePos="0" relativeHeight="251660288" behindDoc="1" locked="0" layoutInCell="1" allowOverlap="1" wp14:anchorId="0CE9A5BE" wp14:editId="7A881F4B">
+              <wp:anchor distT="0" distB="0" distL="114300" distR="114300" simplePos="0" relativeHeight="251660288" behindDoc="1" locked="0" layoutInCell="1" allowOverlap="1" wp14:anchorId="01CF395E" wp14:editId="7A881F4B">
                 <wp:simplePos x="0" y="0"/>
                 <wp:positionH relativeFrom="column">
                   <wp:posOffset>92435</wp:posOffset>

</xml_diff>